<commit_message>
Fix: ajustar margenes y espaciadores para que las 90 fichas ocupen una sola hoja
</commit_message>
<xml_diff>
--- a/static/docx/abierto/Ficha_Tecnica_AlemaniaAbierta_INTELA.docx
+++ b/static/docx/abierto/Ficha_Tecnica_AlemaniaAbierta_INTELA.docx
@@ -949,7 +949,7 @@
     </w:tbl>
     <w:p>
       <w:pPr>
-        <w:spacing w:before="0" w:after="0"/>
+        <w:spacing w:before="0" w:after="0" w:line="100" w:lineRule="exact"/>
       </w:pPr>
     </w:p>
     <w:p>
@@ -1973,7 +1973,7 @@
     </w:tbl>
     <w:p>
       <w:pPr>
-        <w:spacing w:before="0" w:after="0"/>
+        <w:spacing w:before="0" w:after="0" w:line="100" w:lineRule="exact"/>
       </w:pPr>
     </w:p>
     <w:p>
@@ -2030,7 +2030,7 @@
     </w:tbl>
     <w:p>
       <w:pPr>
-        <w:spacing w:before="0" w:after="0"/>
+        <w:spacing w:before="0" w:after="0" w:line="100" w:lineRule="exact"/>
       </w:pPr>
     </w:p>
     <w:tbl>
@@ -2194,7 +2194,7 @@
     </w:tbl>
     <w:sectPr>
       <w:pgSz w:w="11906" w:h="16838"/>
-      <w:pgMar w:top="680" w:right="850" w:bottom="680" w:left="850" w:header="720" w:footer="720" w:gutter="0"/>
+      <w:pgMar w:top="220" w:right="850" w:bottom="220" w:left="850" w:header="720" w:footer="720" w:gutter="0"/>
       <w:cols w:space="720"/>
       <w:docGrid w:linePitch="360"/>
     </w:sectPr>

</xml_diff>